<commit_message>
Convert thesis formulas to Word equations
</commit_message>
<xml_diff>
--- a/ModelWeave_Diploma_Thesis_EN.docx
+++ b/ModelWeave_Diploma_Thesis_EN.docx
@@ -1881,9 +1881,61 @@
         <w:spacing w:after="120" w:line="276" w:lineRule="auto"/>
         <w:jc w:val="center"/>
       </w:pPr>
-      <w:r>
-        <w:t>D = {d_1, d_2, ..., d_n}.</w:t>
-      </w:r>
+      <m:oMathPara>
+        <m:oMathParaPr>
+          <m:jc m:val="center"/>
+        </m:oMathParaPr>
+        <m:oMath>
+          <m:r>
+            <m:t>D = { </m:t>
+          </m:r>
+          <m:sSub>
+            <m:e>
+              <m:r>
+                <m:t>d</m:t>
+              </m:r>
+            </m:e>
+            <m:sub>
+              <m:r>
+                <m:t>1</m:t>
+              </m:r>
+            </m:sub>
+          </m:sSub>
+          <m:r>
+            <m:t>, </m:t>
+          </m:r>
+          <m:sSub>
+            <m:e>
+              <m:r>
+                <m:t>d</m:t>
+              </m:r>
+            </m:e>
+            <m:sub>
+              <m:r>
+                <m:t>2</m:t>
+              </m:r>
+            </m:sub>
+          </m:sSub>
+          <m:r>
+            <m:t>, …, </m:t>
+          </m:r>
+          <m:sSub>
+            <m:e>
+              <m:r>
+                <m:t>d</m:t>
+              </m:r>
+            </m:e>
+            <m:sub>
+              <m:r>
+                <m:t>n</m:t>
+              </m:r>
+            </m:sub>
+          </m:sSub>
+          <m:r>
+            <m:t> }</m:t>
+          </m:r>
+        </m:oMath>
+      </m:oMathPara>
     </w:p>
     <w:p>
       <w:pPr>
@@ -1899,9 +1951,85 @@
         <w:spacing w:after="120" w:line="276" w:lineRule="auto"/>
         <w:jc w:val="center"/>
       </w:pPr>
-      <w:r>
-        <w:t>C_i = {c_{i,1}, c_{i,2}, ..., c_{i,m_i}}.</w:t>
-      </w:r>
+      <m:oMathPara>
+        <m:oMathParaPr>
+          <m:jc m:val="center"/>
+        </m:oMathParaPr>
+        <m:oMath>
+          <m:sSub>
+            <m:e>
+              <m:r>
+                <m:t>C</m:t>
+              </m:r>
+            </m:e>
+            <m:sub>
+              <m:r>
+                <m:t>i</m:t>
+              </m:r>
+            </m:sub>
+          </m:sSub>
+          <m:r>
+            <m:t> = { </m:t>
+          </m:r>
+          <m:sSub>
+            <m:e>
+              <m:r>
+                <m:t>c</m:t>
+              </m:r>
+            </m:e>
+            <m:sub>
+              <m:r>
+                <m:t>i,1</m:t>
+              </m:r>
+            </m:sub>
+          </m:sSub>
+          <m:r>
+            <m:t>, </m:t>
+          </m:r>
+          <m:sSub>
+            <m:e>
+              <m:r>
+                <m:t>c</m:t>
+              </m:r>
+            </m:e>
+            <m:sub>
+              <m:r>
+                <m:t>i,2</m:t>
+              </m:r>
+            </m:sub>
+          </m:sSub>
+          <m:r>
+            <m:t>, …, </m:t>
+          </m:r>
+          <m:sSub>
+            <m:e>
+              <m:r>
+                <m:t>c</m:t>
+              </m:r>
+            </m:e>
+            <m:sub>
+              <m:r>
+                <m:t>i,</m:t>
+              </m:r>
+              <m:sSub>
+                <m:e>
+                  <m:r>
+                    <m:t>m</m:t>
+                  </m:r>
+                </m:e>
+                <m:sub>
+                  <m:r>
+                    <m:t>i</m:t>
+                  </m:r>
+                </m:sub>
+              </m:sSub>
+            </m:sub>
+          </m:sSub>
+          <m:r>
+            <m:t> }</m:t>
+          </m:r>
+        </m:oMath>
+      </m:oMathPara>
     </w:p>
     <w:p>
       <w:pPr>
@@ -1917,9 +2045,48 @@
         <w:spacing w:after="120" w:line="276" w:lineRule="auto"/>
         <w:jc w:val="center"/>
       </w:pPr>
-      <w:r>
-        <w:t>C = ⋃_{i=1}^{n} C_i.</w:t>
-      </w:r>
+      <m:oMathPara>
+        <m:oMathParaPr>
+          <m:jc m:val="center"/>
+        </m:oMathParaPr>
+        <m:oMath>
+          <m:r>
+            <m:t>C = </m:t>
+          </m:r>
+          <m:sSubSup>
+            <m:e>
+              <m:r>
+                <m:t>⋃</m:t>
+              </m:r>
+            </m:e>
+            <m:sub>
+              <m:r>
+                <m:t>i=1</m:t>
+              </m:r>
+            </m:sub>
+            <m:sup>
+              <m:r>
+                <m:t>n</m:t>
+              </m:r>
+            </m:sup>
+          </m:sSubSup>
+          <m:r>
+            <m:t> </m:t>
+          </m:r>
+          <m:sSub>
+            <m:e>
+              <m:r>
+                <m:t>C</m:t>
+              </m:r>
+            </m:e>
+            <m:sub>
+              <m:r>
+                <m:t>i</m:t>
+              </m:r>
+            </m:sub>
+          </m:sSub>
+        </m:oMath>
+      </m:oMathPara>
     </w:p>
     <w:p>
       <w:pPr>
@@ -1943,9 +2110,61 @@
         <w:spacing w:after="120" w:line="276" w:lineRule="auto"/>
         <w:jc w:val="center"/>
       </w:pPr>
-      <w:r>
-        <w:t>E: C -&gt; R^d,     v_{i,j} = E(c_{i,j}).</w:t>
-      </w:r>
+      <m:oMathPara>
+        <m:oMathParaPr>
+          <m:jc m:val="center"/>
+        </m:oMathParaPr>
+        <m:oMath>
+          <m:r>
+            <m:t>E: C → </m:t>
+          </m:r>
+          <m:sSup>
+            <m:e>
+              <m:r>
+                <m:t>ℝ</m:t>
+              </m:r>
+            </m:e>
+            <m:sup>
+              <m:r>
+                <m:t>d</m:t>
+              </m:r>
+            </m:sup>
+          </m:sSup>
+          <m:r>
+            <m:t>,     </m:t>
+          </m:r>
+          <m:sSub>
+            <m:e>
+              <m:r>
+                <m:t>v</m:t>
+              </m:r>
+            </m:e>
+            <m:sub>
+              <m:r>
+                <m:t>i,j</m:t>
+              </m:r>
+            </m:sub>
+          </m:sSub>
+          <m:r>
+            <m:t> = E(</m:t>
+          </m:r>
+          <m:sSub>
+            <m:e>
+              <m:r>
+                <m:t>c</m:t>
+              </m:r>
+            </m:e>
+            <m:sub>
+              <m:r>
+                <m:t>i,j</m:t>
+              </m:r>
+            </m:sub>
+          </m:sSub>
+          <m:r>
+            <m:t>)</m:t>
+          </m:r>
+        </m:oMath>
+      </m:oMathPara>
     </w:p>
     <w:p>
       <w:pPr>
@@ -1961,9 +2180,28 @@
         <w:spacing w:after="120" w:line="276" w:lineRule="auto"/>
         <w:jc w:val="center"/>
       </w:pPr>
-      <w:r>
-        <w:t>v_q = E(q).</w:t>
-      </w:r>
+      <m:oMathPara>
+        <m:oMathParaPr>
+          <m:jc m:val="center"/>
+        </m:oMathParaPr>
+        <m:oMath>
+          <m:sSub>
+            <m:e>
+              <m:r>
+                <m:t>v</m:t>
+              </m:r>
+            </m:e>
+            <m:sub>
+              <m:r>
+                <m:t>q</m:t>
+              </m:r>
+            </m:sub>
+          </m:sSub>
+          <m:r>
+            <m:t> = E(q)</m:t>
+          </m:r>
+        </m:oMath>
+      </m:oMathPara>
     </w:p>
     <w:p>
       <w:pPr>
@@ -1987,9 +2225,115 @@
         <w:spacing w:after="120" w:line="276" w:lineRule="auto"/>
         <w:jc w:val="center"/>
       </w:pPr>
-      <w:r>
-        <w:t>cos(v_q, v_{i,j}) = (v_q · v_{i,j}) / (||v_q|| ||v_{i,j}||).</w:t>
-      </w:r>
+      <m:oMathPara>
+        <m:oMathParaPr>
+          <m:jc m:val="center"/>
+        </m:oMathParaPr>
+        <m:oMath>
+          <m:r>
+            <m:t>cos(</m:t>
+          </m:r>
+          <m:sSub>
+            <m:e>
+              <m:r>
+                <m:t>v</m:t>
+              </m:r>
+            </m:e>
+            <m:sub>
+              <m:r>
+                <m:t>q</m:t>
+              </m:r>
+            </m:sub>
+          </m:sSub>
+          <m:r>
+            <m:t>, </m:t>
+          </m:r>
+          <m:sSub>
+            <m:e>
+              <m:r>
+                <m:t>v</m:t>
+              </m:r>
+            </m:e>
+            <m:sub>
+              <m:r>
+                <m:t>i,j</m:t>
+              </m:r>
+            </m:sub>
+          </m:sSub>
+          <m:r>
+            <m:t>) = </m:t>
+          </m:r>
+          <m:f>
+            <m:fPr>
+              <m:type m:val="bar"/>
+            </m:fPr>
+            <m:num>
+              <m:sSub>
+                <m:e>
+                  <m:r>
+                    <m:t>v</m:t>
+                  </m:r>
+                </m:e>
+                <m:sub>
+                  <m:r>
+                    <m:t>q</m:t>
+                  </m:r>
+                </m:sub>
+              </m:sSub>
+              <m:r>
+                <m:t> · </m:t>
+              </m:r>
+              <m:sSub>
+                <m:e>
+                  <m:r>
+                    <m:t>v</m:t>
+                  </m:r>
+                </m:e>
+                <m:sub>
+                  <m:r>
+                    <m:t>i,j</m:t>
+                  </m:r>
+                </m:sub>
+              </m:sSub>
+            </m:num>
+            <m:den>
+              <m:r>
+                <m:t>‖</m:t>
+              </m:r>
+              <m:sSub>
+                <m:e>
+                  <m:r>
+                    <m:t>v</m:t>
+                  </m:r>
+                </m:e>
+                <m:sub>
+                  <m:r>
+                    <m:t>q</m:t>
+                  </m:r>
+                </m:sub>
+              </m:sSub>
+              <m:r>
+                <m:t>‖ ‖</m:t>
+              </m:r>
+              <m:sSub>
+                <m:e>
+                  <m:r>
+                    <m:t>v</m:t>
+                  </m:r>
+                </m:e>
+                <m:sub>
+                  <m:r>
+                    <m:t>i,j</m:t>
+                  </m:r>
+                </m:sub>
+              </m:sSub>
+              <m:r>
+                <m:t>‖</m:t>
+              </m:r>
+            </m:den>
+          </m:f>
+        </m:oMath>
+      </m:oMathPara>
     </w:p>
     <w:p>
       <w:pPr>
@@ -2005,9 +2349,43 @@
         <w:spacing w:after="120" w:line="276" w:lineRule="auto"/>
         <w:jc w:val="center"/>
       </w:pPr>
-      <w:r>
-        <w:t>R_k(q,u) = top_k { c ∈ C | owner(c)=u } by cos(E(q), E(c)).</w:t>
-      </w:r>
+      <m:oMathPara>
+        <m:oMathParaPr>
+          <m:jc m:val="center"/>
+        </m:oMathParaPr>
+        <m:oMath>
+          <m:sSub>
+            <m:e>
+              <m:r>
+                <m:t>R</m:t>
+              </m:r>
+            </m:e>
+            <m:sub>
+              <m:r>
+                <m:t>k</m:t>
+              </m:r>
+            </m:sub>
+          </m:sSub>
+          <m:r>
+            <m:t>(q,u) = </m:t>
+          </m:r>
+          <m:sSub>
+            <m:e>
+              <m:r>
+                <m:t>top</m:t>
+              </m:r>
+            </m:e>
+            <m:sub>
+              <m:r>
+                <m:t>k</m:t>
+              </m:r>
+            </m:sub>
+          </m:sSub>
+          <m:r>
+            <m:t> { c ∈ C | owner(c)=u }  ranked by  cos(E(q), E(c))</m:t>
+          </m:r>
+        </m:oMath>
+      </m:oMathPara>
     </w:p>
     <w:p>
       <w:pPr>
@@ -2031,9 +2409,31 @@
         <w:spacing w:after="120" w:line="276" w:lineRule="auto"/>
         <w:jc w:val="center"/>
       </w:pPr>
-      <w:r>
-        <w:t>G = (V, E_g),</w:t>
-      </w:r>
+      <m:oMathPara>
+        <m:oMathParaPr>
+          <m:jc m:val="center"/>
+        </m:oMathParaPr>
+        <m:oMath>
+          <m:r>
+            <m:t>G = (V, </m:t>
+          </m:r>
+          <m:sSub>
+            <m:e>
+              <m:r>
+                <m:t>E</m:t>
+              </m:r>
+            </m:e>
+            <m:sub>
+              <m:r>
+                <m:t>g</m:t>
+              </m:r>
+            </m:sub>
+          </m:sSub>
+          <m:r>
+            <m:t>)</m:t>
+          </m:r>
+        </m:oMath>
+      </m:oMathPara>
     </w:p>
     <w:p>
       <w:pPr>
@@ -2049,9 +2449,16 @@
         <w:spacing w:after="120" w:line="276" w:lineRule="auto"/>
         <w:jc w:val="center"/>
       </w:pPr>
-      <w:r>
-        <w:t>τ = topological_sort(G).</w:t>
-      </w:r>
+      <m:oMathPara>
+        <m:oMathParaPr>
+          <m:jc m:val="center"/>
+        </m:oMathParaPr>
+        <m:oMath>
+          <m:r>
+            <m:t>τ = topological_sort(G)</m:t>
+          </m:r>
+        </m:oMath>
+      </m:oMathPara>
     </w:p>
     <w:p>
       <w:pPr>
@@ -2075,9 +2482,142 @@
         <w:spacing w:after="120" w:line="276" w:lineRule="auto"/>
         <w:jc w:val="center"/>
       </w:pPr>
-      <w:r>
-        <w:t>S = (w_c C + w_a A + w_r R + w_m M) / (w_c + w_a + w_r + w_m).</w:t>
-      </w:r>
+      <m:oMathPara>
+        <m:oMathParaPr>
+          <m:jc m:val="center"/>
+        </m:oMathParaPr>
+        <m:oMath>
+          <m:r>
+            <m:t>S = </m:t>
+          </m:r>
+          <m:f>
+            <m:fPr>
+              <m:type m:val="bar"/>
+            </m:fPr>
+            <m:num>
+              <m:sSub>
+                <m:e>
+                  <m:r>
+                    <m:t>w</m:t>
+                  </m:r>
+                </m:e>
+                <m:sub>
+                  <m:r>
+                    <m:t>c</m:t>
+                  </m:r>
+                </m:sub>
+              </m:sSub>
+              <m:r>
+                <m:t>C + </m:t>
+              </m:r>
+              <m:sSub>
+                <m:e>
+                  <m:r>
+                    <m:t>w</m:t>
+                  </m:r>
+                </m:e>
+                <m:sub>
+                  <m:r>
+                    <m:t>a</m:t>
+                  </m:r>
+                </m:sub>
+              </m:sSub>
+              <m:r>
+                <m:t>A + </m:t>
+              </m:r>
+              <m:sSub>
+                <m:e>
+                  <m:r>
+                    <m:t>w</m:t>
+                  </m:r>
+                </m:e>
+                <m:sub>
+                  <m:r>
+                    <m:t>r</m:t>
+                  </m:r>
+                </m:sub>
+              </m:sSub>
+              <m:r>
+                <m:t>R + </m:t>
+              </m:r>
+              <m:sSub>
+                <m:e>
+                  <m:r>
+                    <m:t>w</m:t>
+                  </m:r>
+                </m:e>
+                <m:sub>
+                  <m:r>
+                    <m:t>m</m:t>
+                  </m:r>
+                </m:sub>
+              </m:sSub>
+              <m:r>
+                <m:t>M</m:t>
+              </m:r>
+            </m:num>
+            <m:den>
+              <m:sSub>
+                <m:e>
+                  <m:r>
+                    <m:t>w</m:t>
+                  </m:r>
+                </m:e>
+                <m:sub>
+                  <m:r>
+                    <m:t>c</m:t>
+                  </m:r>
+                </m:sub>
+              </m:sSub>
+              <m:r>
+                <m:t> + </m:t>
+              </m:r>
+              <m:sSub>
+                <m:e>
+                  <m:r>
+                    <m:t>w</m:t>
+                  </m:r>
+                </m:e>
+                <m:sub>
+                  <m:r>
+                    <m:t>a</m:t>
+                  </m:r>
+                </m:sub>
+              </m:sSub>
+              <m:r>
+                <m:t> + </m:t>
+              </m:r>
+              <m:sSub>
+                <m:e>
+                  <m:r>
+                    <m:t>w</m:t>
+                  </m:r>
+                </m:e>
+                <m:sub>
+                  <m:r>
+                    <m:t>r</m:t>
+                  </m:r>
+                </m:sub>
+              </m:sSub>
+              <m:r>
+                <m:t> + </m:t>
+              </m:r>
+              <m:sSub>
+                <m:e>
+                  <m:r>
+                    <m:t>w</m:t>
+                  </m:r>
+                </m:e>
+                <m:sub>
+                  <m:r>
+                    <m:t>m</m:t>
+                  </m:r>
+                </m:sub>
+              </m:sSub>
+            </m:den>
+          </m:f>
+        </m:oMath>
+      </m:oMathPara>
     </w:p>
     <w:p>
       <w:pPr>
@@ -6064,12 +6604,46 @@
         <w:spacing w:after="120" w:line="276" w:lineRule="auto"/>
         <w:jc w:val="center"/>
       </w:pPr>
-      <w:r>
-        <w:rPr>
-          <w:rFonts w:ascii="Cambria Math" w:hAnsi="Cambria Math" w:eastAsia="Cambria Math"/>
-        </w:rPr>
-        <w:t>storage(D) = storage_relational(C, metadata) + storage_vector(E(C), payload).</w:t>
-      </w:r>
+      <m:oMathPara>
+        <m:oMathParaPr>
+          <m:jc m:val="center"/>
+        </m:oMathParaPr>
+        <m:oMath>
+          <m:r>
+            <m:t>storage(D) = </m:t>
+          </m:r>
+          <m:sSub>
+            <m:e>
+              <m:r>
+                <m:t>storage</m:t>
+              </m:r>
+            </m:e>
+            <m:sub>
+              <m:r>
+                <m:t>relational</m:t>
+              </m:r>
+            </m:sub>
+          </m:sSub>
+          <m:r>
+            <m:t>(C, metadata) + </m:t>
+          </m:r>
+          <m:sSub>
+            <m:e>
+              <m:r>
+                <m:t>storage</m:t>
+              </m:r>
+            </m:e>
+            <m:sub>
+              <m:r>
+                <m:t>vector</m:t>
+              </m:r>
+            </m:sub>
+          </m:sSub>
+          <m:r>
+            <m:t>(E(C), payload)</m:t>
+          </m:r>
+        </m:oMath>
+      </m:oMathPara>
     </w:p>
     <w:p>
       <w:pPr>
@@ -6118,12 +6692,55 @@
         <w:spacing w:after="120" w:line="276" w:lineRule="auto"/>
         <w:jc w:val="center"/>
       </w:pPr>
-      <w:r>
-        <w:rPr>
-          <w:rFonts w:ascii="Cambria Math" w:hAnsi="Cambria Math" w:eastAsia="Cambria Math"/>
-        </w:rPr>
-        <w:t>context_t = prompt + R_k(q,u) + workspace(u) + trace_{1:t-1}.</w:t>
-      </w:r>
+      <m:oMathPara>
+        <m:oMathParaPr>
+          <m:jc m:val="center"/>
+        </m:oMathParaPr>
+        <m:oMath>
+          <m:sSub>
+            <m:e>
+              <m:r>
+                <m:t>context</m:t>
+              </m:r>
+            </m:e>
+            <m:sub>
+              <m:r>
+                <m:t>t</m:t>
+              </m:r>
+            </m:sub>
+          </m:sSub>
+          <m:r>
+            <m:t> = prompt + </m:t>
+          </m:r>
+          <m:sSub>
+            <m:e>
+              <m:r>
+                <m:t>R</m:t>
+              </m:r>
+            </m:e>
+            <m:sub>
+              <m:r>
+                <m:t>k</m:t>
+              </m:r>
+            </m:sub>
+          </m:sSub>
+          <m:r>
+            <m:t>(q,u) + workspace(u) + </m:t>
+          </m:r>
+          <m:sSub>
+            <m:e>
+              <m:r>
+                <m:t>trace</m:t>
+              </m:r>
+            </m:e>
+            <m:sub>
+              <m:r>
+                <m:t>1:t−1</m:t>
+              </m:r>
+            </m:sub>
+          </m:sSub>
+        </m:oMath>
+      </m:oMathPara>
     </w:p>
     <w:p>
       <w:pPr>
@@ -6164,12 +6781,16 @@
         <w:spacing w:after="120" w:line="276" w:lineRule="auto"/>
         <w:jc w:val="center"/>
       </w:pPr>
-      <w:r>
-        <w:rPr>
-          <w:rFonts w:ascii="Cambria Math" w:hAnsi="Cambria Math" w:eastAsia="Cambria Math"/>
-        </w:rPr>
-        <w:t>A = {pending, approved, rejected},     δ(pending, approve)=approved,     δ(pending, reject)=rejected.</w:t>
-      </w:r>
+      <m:oMathPara>
+        <m:oMathParaPr>
+          <m:jc m:val="center"/>
+        </m:oMathParaPr>
+        <m:oMath>
+          <m:r>
+            <m:t>A = {pending, approved, rejected},     δ(pending, approve)=approved,     δ(pending, reject)=rejected</m:t>
+          </m:r>
+        </m:oMath>
+      </m:oMathPara>
     </w:p>
     <w:p>
       <w:pPr>
@@ -6177,12 +6798,16 @@
         <w:spacing w:after="120" w:line="276" w:lineRule="auto"/>
         <w:jc w:val="center"/>
       </w:pPr>
-      <w:r>
-        <w:rPr>
-          <w:rFonts w:ascii="Cambria Math" w:hAnsi="Cambria Math" w:eastAsia="Cambria Math"/>
-        </w:rPr>
-        <w:t>persistent_change(x) is allowed iff approval_state(x)=approved.</w:t>
-      </w:r>
+      <m:oMathPara>
+        <m:oMathParaPr>
+          <m:jc m:val="center"/>
+        </m:oMathParaPr>
+        <m:oMath>
+          <m:r>
+            <m:t>persistent_change(x) ⇔ approval_state(x)=approved</m:t>
+          </m:r>
+        </m:oMath>
+      </m:oMathPara>
     </w:p>
     <w:p>
       <w:pPr>
@@ -6280,12 +6905,108 @@
         <w:spacing w:after="120" w:line="276" w:lineRule="auto"/>
         <w:jc w:val="center"/>
       </w:pPr>
-      <w:r>
-        <w:rPr>
-          <w:rFonts w:ascii="Cambria Math" w:hAnsi="Cambria Math" w:eastAsia="Cambria Math"/>
-        </w:rPr>
-        <w:t>T_run ≈ T_retrieve(N,k) + Σ_{i=1}^{a} T_LLM(prompt_i) + T_persist(events, approvals, report).</w:t>
-      </w:r>
+      <m:oMathPara>
+        <m:oMathParaPr>
+          <m:jc m:val="center"/>
+        </m:oMathParaPr>
+        <m:oMath>
+          <m:sSub>
+            <m:e>
+              <m:r>
+                <m:t>T</m:t>
+              </m:r>
+            </m:e>
+            <m:sub>
+              <m:r>
+                <m:t>run</m:t>
+              </m:r>
+            </m:sub>
+          </m:sSub>
+          <m:r>
+            <m:t> ≈ </m:t>
+          </m:r>
+          <m:sSub>
+            <m:e>
+              <m:r>
+                <m:t>T</m:t>
+              </m:r>
+            </m:e>
+            <m:sub>
+              <m:r>
+                <m:t>retrieve</m:t>
+              </m:r>
+            </m:sub>
+          </m:sSub>
+          <m:r>
+            <m:t>(N,k) + </m:t>
+          </m:r>
+          <m:sSubSup>
+            <m:e>
+              <m:r>
+                <m:t>Σ</m:t>
+              </m:r>
+            </m:e>
+            <m:sub>
+              <m:r>
+                <m:t>i=1</m:t>
+              </m:r>
+            </m:sub>
+            <m:sup>
+              <m:r>
+                <m:t>a</m:t>
+              </m:r>
+            </m:sup>
+          </m:sSubSup>
+          <m:r>
+            <m:t> </m:t>
+          </m:r>
+          <m:sSub>
+            <m:e>
+              <m:r>
+                <m:t>T</m:t>
+              </m:r>
+            </m:e>
+            <m:sub>
+              <m:r>
+                <m:t>LLM</m:t>
+              </m:r>
+            </m:sub>
+          </m:sSub>
+          <m:r>
+            <m:t>(prompt</m:t>
+          </m:r>
+          <m:sSub>
+            <m:e>
+              <m:r>
+                <m:t/>
+              </m:r>
+            </m:e>
+            <m:sub>
+              <m:r>
+                <m:t>i</m:t>
+              </m:r>
+            </m:sub>
+          </m:sSub>
+          <m:r>
+            <m:t>) + </m:t>
+          </m:r>
+          <m:sSub>
+            <m:e>
+              <m:r>
+                <m:t>T</m:t>
+              </m:r>
+            </m:e>
+            <m:sub>
+              <m:r>
+                <m:t>persist</m:t>
+              </m:r>
+            </m:sub>
+          </m:sSub>
+          <m:r>
+            <m:t>(events, approvals, report)</m:t>
+          </m:r>
+        </m:oMath>
+      </m:oMathPara>
     </w:p>
     <w:p>
       <w:pPr>

</xml_diff>